<commit_message>
fix(docx): remediate docx renderer wave-1
Co-authored-by: Cursor <cursoragent@cursor.com>
</commit_message>
<xml_diff>
--- a/storage/templates/normalized-docx/BM-054/BM-054_normalized.docx
+++ b/storage/templates/normalized-docx/BM-054/BM-054_normalized.docx
@@ -265,24 +265,7 @@
                 <w:sz w:val="26"/>
                 <w:szCs w:val="26"/>
               </w:rPr>
-              <w:t>{{</w:t>
-            </w:r>
-            <w:r>
-              <w:rPr>
-                <w:rFonts w:ascii="Times New Roman" w:hAnsi="Times New Roman" w:eastAsia="SimSun" w:cs="Times New Roman"/>
-                <w:sz w:val="26"/>
-                <w:szCs w:val="26"/>
-                <w:u w:val="none"/>
-              </w:rPr>
-              <w:t>agency.name</w:t>
-            </w:r>
-            <w:r>
-              <w:rPr>
-                <w:rFonts w:ascii="Times New Roman" w:hAnsi="Times New Roman" w:eastAsia="SimSun" w:cs="Times New Roman"/>
-                <w:sz w:val="26"/>
-                <w:szCs w:val="26"/>
-              </w:rPr>
-              <w:t>}}</w:t>
+              <w:t>{{agency.name}}</w:t>
             </w:r>
           </w:p>
         </w:tc>

</xml_diff>